<commit_message>
SAVEPOINT: Web UI MVP upgrades (model selector + cost, min_conf slider + per-request override, vision overlay + diagnostics, /debug/vision endpoint, serve /output, Responses JSON mode); save only on changes
</commit_message>
<xml_diff>
--- a/output/test3.docx
+++ b/output/test3.docx
@@ -69,7 +69,7 @@
     </w:p>
     <w:p>
       <w:pPr>
-        <w:pStyle w:val="CoverTitle"/>
+        <w:pStyle w:val="CoverSubtitle"/>
         <w:rPr>
           <w:lang w:val="en-US"/>
         </w:rPr>
@@ -90,7 +90,7 @@
     </w:p>
     <w:p>
       <w:pPr>
-        <w:pStyle w:val="CoverTitle"/>
+        <w:pStyle w:val="CoverAuthor"/>
       </w:pPr>
       <w:bookmarkStart w:id="1" w:name="id_1384414032576179649"/>
       <w:bookmarkEnd w:id="1"/>
@@ -138,7 +138,6 @@
         <w:br/>
       </w:r>
       <w:r>
-        <w:rPr/>
         <w:t>Thomas Cooper</w:t>
       </w:r>
     </w:p>

</xml_diff>